<commit_message>
Report: evidence-auditor round 1 fixes
- Gaps qualified and scoped to the loaded clause set and the hypothetical scenario; the claim
  about other approaches narrowed to what the incident shows.
- Illustrative rules named as such (introduction, P requirement, mapping table labels).
- SINK row lists the five approved example clauses (the UNESCO wildcard included a rejected one).
- art4/art16 moved from C to P (prohibitions); PP clauses marked a working reading, not a legal
  conclusion; Readiness dimensions placed only where the audit gives the rationale.
- Controversy: the shared scripted T+60 tied to the same scripted decisions; live T+15 set only
  against the live governed run; the repair labelled scripted, not tested with live agents;
  the approved authority phrase reused; waived reasons listed.
- Masked items: 'candidate gaps the rank-1 repair leaves open', not 'the strongest gaps'.

Co-Authored-By: Claude Opus 5.5 <noreply@anthropic.com>
</commit_message>
<xml_diff>
--- a/docs/report/cascadeguard-report.docx
+++ b/docs/report/cascadeguard-report.docx
@@ -134,7 +134,7 @@
           <w:rFonts w:ascii="Times New Roman" w:hAnsi="Times New Roman"/>
           <w:sz w:val="21"/>
         </w:rPr>
-        <w:t>CascadeGuard finds where AI decisions and institutional rules collide, identifies the smallest safe repair, and replays the same incident to test whether the repair works. Six institutional roles are played by agents (scripted, or a live LLM); a deterministic engine, never an agent, accepts or rejects every proposed action against reviewed clauses quoted verbatim from UAE and international documents. It is decision support, not legal interpretation: every diagnosed failure is a candidate gap for expert review, not a confirmed legal or standards gap. The scenario is hypothetical and all data is synthetic.</w:t>
+        <w:t>CascadeGuard finds where AI decisions and institutional rules collide, identifies the smallest safe repair, and replays the same incident to test whether the repair works. Six institutional roles are played by agents (scripted, or a live LLM); a deterministic engine, never an agent, accepts or rejects every proposed action against the loaded clause set: reviewed clauses quoted verbatim from UAE and international documents, and two illustrative scenario rules. It is decision support, not legal interpretation: every diagnosed failure is a candidate gap for expert review, not a confirmed legal or standards gap. The scenario is hypothetical and all data is synthetic.</w:t>
       </w:r>
     </w:p>
     <w:p>
@@ -188,7 +188,7 @@
           <w:rFonts w:ascii="Times New Roman" w:hAnsi="Times New Roman"/>
           <w:sz w:val="21"/>
         </w:rPr>
-        <w:t xml:space="preserve"> Reviewing one organisation or one AI system at a time cannot explain this incident: the harm comes from two AI systems in two sectors, and from rules that do not connect them: the health operator needs the network status but it lies outside its information boundary; no role is found responsible for reversing the automated lockouts; nothing triggers a review of an AI alert that may be another organisation's AI error.</w:t>
+        <w:t xml:space="preserve"> The incident crosses two AI systems in two sectors, so a review of either organisation alone sees only half of it. In this hypothetical scenario the health operator needs the network status, but the scenario places it outside the operator's information boundary; no clause in the loaded clause set authorises that share, assigns an owner for reversing the automated lockouts, or triggers a review of an AI alert that may be another organisation's AI error. Each is a candidate gap for expert review, not a confirmed legal or standards gap.</w:t>
       </w:r>
     </w:p>
     <w:p>
@@ -258,7 +258,7 @@
           <w:rFonts w:ascii="Times New Roman" w:hAnsi="Times New Roman"/>
           <w:sz w:val="21"/>
         </w:rPr>
-        <w:t xml:space="preserve"> timed injects with facts, each fact naming its holder and recipients; synthetic data only.</w:t>
+        <w:t xml:space="preserve"> timed injects with facts; each fact names its holder and each inject its recipients; synthetic data only.</w:t>
       </w:r>
     </w:p>
     <w:p>
@@ -286,7 +286,7 @@
           <w:rFonts w:ascii="Times New Roman" w:hAnsi="Times New Roman"/>
           <w:sz w:val="21"/>
         </w:rPr>
-        <w:t xml:space="preserve"> each role receives only the facts inside its information boundary, at the inject that releases them.</w:t>
+        <w:t xml:space="preserve"> each role receives only the facts inside its information boundary (scenario data), at the inject that releases them.</w:t>
       </w:r>
     </w:p>
     <w:p>
@@ -370,7 +370,7 @@
           <w:rFonts w:ascii="Times New Roman" w:hAnsi="Times New Roman"/>
           <w:sz w:val="21"/>
         </w:rPr>
-        <w:t xml:space="preserve"> an action is applied only if it passes the role's permissions, the information boundaries, cited evidence (reviewed clause IDs only) and the clauses' authority, prohibitions and safeguards. A suspected legal gap counts only as a cited, qualified claim.</w:t>
+        <w:t xml:space="preserve"> an action is applied only if it passes the role's permissions, the information boundaries, cited evidence (loaded clause IDs only: reviewed or illustrative, never draft) and the clauses' authority, prohibitions and safeguards. A suspected legal gap counts only as a cited, qualified claim.</w:t>
       </w:r>
     </w:p>
     <w:p>
@@ -788,7 +788,7 @@
                 <w:rFonts w:ascii="Times New Roman" w:hAnsi="Times New Roman"/>
                 <w:sz w:val="17"/>
               </w:rPr>
-              <w:t>Strategy Alignment</w:t>
+              <w:t>—</w:t>
             </w:r>
           </w:p>
         </w:tc>
@@ -809,31 +809,10 @@
             </w:pPr>
             <w:r>
               <w:rPr>
-                <w:rFonts w:ascii="Consolas" w:hAnsi="Consolas"/>
-                <w:sz w:val="15"/>
-              </w:rPr>
-              <w:t>uae.fl2-2019.art4</w:t>
-            </w:r>
-            <w:r>
-              <w:rPr>
-                <w:rFonts w:ascii="Times New Roman" w:hAnsi="Times New Roman"/>
-                <w:sz w:val="17"/>
-              </w:rPr>
-              <w:t xml:space="preserve">, </w:t>
-            </w:r>
-            <w:r>
-              <w:rPr>
-                <w:rFonts w:ascii="Consolas" w:hAnsi="Consolas"/>
-                <w:sz w:val="15"/>
-              </w:rPr>
-              <w:t>uae.fl2-2019.art16</w:t>
-            </w:r>
-            <w:r>
-              <w:rPr>
-                <w:rFonts w:ascii="Times New Roman" w:hAnsi="Times New Roman"/>
-                <w:sz w:val="17"/>
-              </w:rPr>
-              <w:t xml:space="preserve"> (restrictions on sharing health data)</w:t>
+                <w:rFonts w:ascii="Times New Roman" w:hAnsi="Times New Roman"/>
+                <w:sz w:val="17"/>
+              </w:rPr>
+              <w:t>— (information boundaries are scenario data)</w:t>
             </w:r>
           </w:p>
         </w:tc>
@@ -966,7 +945,7 @@
                 <w:rFonts w:ascii="Times New Roman" w:hAnsi="Times New Roman"/>
                 <w:sz w:val="17"/>
               </w:rPr>
-              <w:t xml:space="preserve"> (which regime applies)</w:t>
+              <w:t xml:space="preserve"> (binding unknown): working reading of the applicable regime, not a legal conclusion</w:t>
             </w:r>
           </w:p>
         </w:tc>
@@ -1071,7 +1050,7 @@
                 <w:rFonts w:ascii="Times New Roman" w:hAnsi="Times New Roman"/>
                 <w:sz w:val="17"/>
               </w:rPr>
-              <w:t xml:space="preserve"> (context for suspending the traffic model; not binding)</w:t>
+              <w:t xml:space="preserve"> (not binding; context for suspending the traffic model)</w:t>
             </w:r>
           </w:p>
         </w:tc>
@@ -1169,7 +1148,7 @@
                 <w:rFonts w:ascii="Consolas" w:hAnsi="Consolas"/>
                 <w:sz w:val="15"/>
               </w:rPr>
-              <w:t>dha.pp11.4-18-1</w:t>
+              <w:t>uae.fl2-2019.art4</w:t>
             </w:r>
             <w:r>
               <w:rPr>
@@ -1183,35 +1162,35 @@
                 <w:rFonts w:ascii="Consolas" w:hAnsi="Consolas"/>
                 <w:sz w:val="15"/>
               </w:rPr>
-              <w:t>dha.pp11.4-18-2</w:t>
-            </w:r>
-            <w:r>
-              <w:rPr>
-                <w:rFonts w:ascii="Times New Roman" w:hAnsi="Times New Roman"/>
-                <w:sz w:val="17"/>
-              </w:rPr>
-              <w:t xml:space="preserve">, </w:t>
+              <w:t>uae.fl2-2019.art16</w:t>
+            </w:r>
+            <w:r>
+              <w:rPr>
+                <w:rFonts w:ascii="Times New Roman" w:hAnsi="Times New Roman"/>
+                <w:sz w:val="17"/>
+              </w:rPr>
+              <w:t xml:space="preserve"> (prohibitions); </w:t>
             </w:r>
             <w:r>
               <w:rPr>
                 <w:rFonts w:ascii="Consolas" w:hAnsi="Consolas"/>
                 <w:sz w:val="15"/>
               </w:rPr>
-              <w:t>dha.pp11.4-18-4</w:t>
-            </w:r>
-            <w:r>
-              <w:rPr>
-                <w:rFonts w:ascii="Times New Roman" w:hAnsi="Times New Roman"/>
-                <w:sz w:val="17"/>
-              </w:rPr>
-              <w:t xml:space="preserve">, </w:t>
+              <w:t>uae.fl2-2019.art6</w:t>
+            </w:r>
+            <w:r>
+              <w:rPr>
+                <w:rFonts w:ascii="Times New Roman" w:hAnsi="Times New Roman"/>
+                <w:sz w:val="17"/>
+              </w:rPr>
+              <w:t xml:space="preserve">; </w:t>
             </w:r>
             <w:r>
               <w:rPr>
                 <w:rFonts w:ascii="Consolas" w:hAnsi="Consolas"/>
                 <w:sz w:val="15"/>
               </w:rPr>
-              <w:t>uae.fl2-2019.art6</w:t>
+              <w:t>dha.pp11.4-18-1</w:t>
             </w:r>
             <w:r>
               <w:rPr>
@@ -1225,7 +1204,7 @@
                 <w:rFonts w:ascii="Consolas" w:hAnsi="Consolas"/>
                 <w:sz w:val="15"/>
               </w:rPr>
-              <w:t>uae.ai-charter.human-oversight</w:t>
+              <w:t>dha.pp11.4-18-2</w:t>
             </w:r>
             <w:r>
               <w:rPr>
@@ -1239,21 +1218,56 @@
                 <w:rFonts w:ascii="Consolas" w:hAnsi="Consolas"/>
                 <w:sz w:val="15"/>
               </w:rPr>
-              <w:t>illus.telecom.incident-report</w:t>
-            </w:r>
-            <w:r>
-              <w:rPr>
-                <w:rFonts w:ascii="Times New Roman" w:hAnsi="Times New Roman"/>
-                <w:sz w:val="17"/>
-              </w:rPr>
-              <w:t xml:space="preserve">, </w:t>
+              <w:t>dha.pp11.4-18-4</w:t>
+            </w:r>
+            <w:r>
+              <w:rPr>
+                <w:rFonts w:ascii="Times New Roman" w:hAnsi="Times New Roman"/>
+                <w:sz w:val="17"/>
+              </w:rPr>
+              <w:t xml:space="preserve"> (binding unknown); </w:t>
             </w:r>
             <w:r>
               <w:rPr>
                 <w:rFonts w:ascii="Consolas" w:hAnsi="Consolas"/>
                 <w:sz w:val="15"/>
               </w:rPr>
+              <w:t>uae.ai-charter.human-oversight</w:t>
+            </w:r>
+            <w:r>
+              <w:rPr>
+                <w:rFonts w:ascii="Times New Roman" w:hAnsi="Times New Roman"/>
+                <w:sz w:val="17"/>
+              </w:rPr>
+              <w:t xml:space="preserve"> (not binding); </w:t>
+            </w:r>
+            <w:r>
+              <w:rPr>
+                <w:rFonts w:ascii="Consolas" w:hAnsi="Consolas"/>
+                <w:sz w:val="15"/>
+              </w:rPr>
+              <w:t>illus.telecom.incident-report</w:t>
+            </w:r>
+            <w:r>
+              <w:rPr>
+                <w:rFonts w:ascii="Times New Roman" w:hAnsi="Times New Roman"/>
+                <w:sz w:val="17"/>
+              </w:rPr>
+              <w:t xml:space="preserve">, </w:t>
+            </w:r>
+            <w:r>
+              <w:rPr>
+                <w:rFonts w:ascii="Consolas" w:hAnsi="Consolas"/>
+                <w:sz w:val="15"/>
+              </w:rPr>
               <w:t>illus.telecom.regulator-information-request</w:t>
+            </w:r>
+            <w:r>
+              <w:rPr>
+                <w:rFonts w:ascii="Times New Roman" w:hAnsi="Times New Roman"/>
+                <w:sz w:val="17"/>
+              </w:rPr>
+              <w:t xml:space="preserve"> (illustrative, synthetic)</w:t>
             </w:r>
           </w:p>
         </w:tc>
@@ -1358,7 +1372,7 @@
                 <w:rFonts w:ascii="Times New Roman" w:hAnsi="Times New Roman"/>
                 <w:sz w:val="17"/>
               </w:rPr>
-              <w:t xml:space="preserve">, </w:t>
+              <w:t xml:space="preserve"> (illustrative, synthetic); </w:t>
             </w:r>
             <w:r>
               <w:rPr>
@@ -1372,7 +1386,7 @@
                 <w:rFonts w:ascii="Times New Roman" w:hAnsi="Times New Roman"/>
                 <w:sz w:val="17"/>
               </w:rPr>
-              <w:t xml:space="preserve"> (reporting duties)</w:t>
+              <w:t xml:space="preserve"> (binding unknown)</w:t>
             </w:r>
           </w:p>
         </w:tc>
@@ -1470,14 +1484,14 @@
                 <w:rFonts w:ascii="Times New Roman" w:hAnsi="Times New Roman"/>
                 <w:sz w:val="17"/>
               </w:rPr>
-              <w:t xml:space="preserve">Reviewed example mapping: </w:t>
+              <w:t xml:space="preserve">Reviewed example mapping (not binding): </w:t>
             </w:r>
             <w:r>
               <w:rPr>
                 <w:rFonts w:ascii="Consolas" w:hAnsi="Consolas"/>
                 <w:sz w:val="15"/>
               </w:rPr>
-              <w:t>oecd.ai-principles.*</w:t>
+              <w:t>oecd.ai-principles.accountability-cooperation</w:t>
             </w:r>
             <w:r>
               <w:rPr>
@@ -1491,7 +1505,7 @@
                 <w:rFonts w:ascii="Consolas" w:hAnsi="Consolas"/>
                 <w:sz w:val="15"/>
               </w:rPr>
-              <w:t>unesco.ai-ethics.*</w:t>
+              <w:t>oecd.ai-principles.robustness-override</w:t>
             </w:r>
             <w:r>
               <w:rPr>
@@ -1505,14 +1519,35 @@
                 <w:rFonts w:ascii="Consolas" w:hAnsi="Consolas"/>
                 <w:sz w:val="15"/>
               </w:rPr>
+              <w:t>unesco.ai-ethics.review-and-correct</w:t>
+            </w:r>
+            <w:r>
+              <w:rPr>
+                <w:rFonts w:ascii="Times New Roman" w:hAnsi="Times New Roman"/>
+                <w:sz w:val="17"/>
+              </w:rPr>
+              <w:t xml:space="preserve">, </w:t>
+            </w:r>
+            <w:r>
+              <w:rPr>
+                <w:rFonts w:ascii="Consolas" w:hAnsi="Consolas"/>
+                <w:sz w:val="15"/>
+              </w:rPr>
+              <w:t>unesco.ai-ethics.human-oversight</w:t>
+            </w:r>
+            <w:r>
+              <w:rPr>
+                <w:rFonts w:ascii="Times New Roman" w:hAnsi="Times New Roman"/>
+                <w:sz w:val="17"/>
+              </w:rPr>
+              <w:t xml:space="preserve">, </w:t>
+            </w:r>
+            <w:r>
+              <w:rPr>
+                <w:rFonts w:ascii="Consolas" w:hAnsi="Consolas"/>
+                <w:sz w:val="15"/>
+              </w:rPr>
               <w:t>uae.ai-charter.human-oversight</w:t>
-            </w:r>
-            <w:r>
-              <w:rPr>
-                <w:rFonts w:ascii="Times New Roman" w:hAnsi="Times New Roman"/>
-                <w:sz w:val="17"/>
-              </w:rPr>
-              <w:t xml:space="preserve"> (not binding)</w:t>
             </w:r>
           </w:p>
         </w:tc>
@@ -1586,7 +1621,7 @@
                 <w:rFonts w:ascii="Times New Roman" w:hAnsi="Times New Roman"/>
                 <w:sz w:val="17"/>
               </w:rPr>
-              <w:t>Cross-domain correlation analysis</w:t>
+              <w:t>AI &amp; Policies</w:t>
             </w:r>
           </w:p>
         </w:tc>
@@ -2162,7 +2197,7 @@
           <w:rFonts w:ascii="Times New Roman" w:hAnsi="Times New Roman"/>
           <w:sz w:val="21"/>
         </w:rPr>
-        <w:t xml:space="preserve">, </w:t>
+        <w:t xml:space="preserve"> (missing_information, no_authority), </w:t>
       </w:r>
       <w:r>
         <w:rPr>
@@ -2176,7 +2211,7 @@
           <w:rFonts w:ascii="Times New Roman" w:hAnsi="Times New Roman"/>
           <w:sz w:val="21"/>
         </w:rPr>
-        <w:t xml:space="preserve"> and </w:t>
+        <w:t xml:space="preserve"> (authority_uncertain) and </w:t>
       </w:r>
       <w:r>
         <w:rPr>
@@ -2190,7 +2225,7 @@
           <w:rFonts w:ascii="Times New Roman" w:hAnsi="Times New Roman"/>
           <w:sz w:val="21"/>
         </w:rPr>
-        <w:t xml:space="preserve">. </w:t>
+        <w:t xml:space="preserve"> (authority_uncertain). </w:t>
       </w:r>
       <w:r>
         <w:rPr>
@@ -2328,7 +2363,7 @@
           <w:rFonts w:ascii="Times New Roman" w:hAnsi="Times New Roman"/>
           <w:sz w:val="21"/>
         </w:rPr>
-        <w:t xml:space="preserve"> With a live model, the governed run shows the same 4 failures. In the ungoverned live run, </w:t>
+        <w:t xml:space="preserve"> With a live model, the governed run shows the same 4 failures and </w:t>
       </w:r>
       <w:r>
         <w:rPr>
@@ -2342,7 +2377,7 @@
           <w:rFonts w:ascii="Times New Roman" w:hAnsi="Times New Roman"/>
           <w:sz w:val="21"/>
         </w:rPr>
-        <w:t xml:space="preserve"> is met at T+15, through </w:t>
+        <w:t xml:space="preserve"> stays unmet. In the ungoverned live run it is met at T+15, through </w:t>
       </w:r>
       <w:r>
         <w:rPr>
@@ -2390,13 +2425,55 @@
           <w:rFonts w:ascii="Times New Roman" w:hAnsi="Times New Roman"/>
           <w:sz w:val="21"/>
         </w:rPr>
-        <w:t xml:space="preserve"> at T+60: here governance with the repair costs no time, and only the repair meets every critical goal. With live agents, the ungoverned run is faster (T+15), and no live repair exists to compare it with; the two sets of agents are not compared as if they were the same. CascadeGuard's answer: the speed came from an action without settled authority. The engine makes that visible as a diagnosed orphan duty (</w:t>
+        <w:t xml:space="preserve"> at T+60, with the same scripted decisions: here governance with the repair costs no time, and only the repair run also meets </w:t>
       </w:r>
       <w:r>
         <w:rPr>
           <w:rFonts w:ascii="Consolas" w:hAnsi="Consolas"/>
           <w:sz w:val="19"/>
         </w:rPr>
+        <w:t>alert_cause_known_to_health</w:t>
+      </w:r>
+      <w:r>
+        <w:rPr>
+          <w:rFonts w:ascii="Times New Roman" w:hAnsi="Times New Roman"/>
+          <w:sz w:val="21"/>
+        </w:rPr>
+        <w:t xml:space="preserve">. With live agents, </w:t>
+      </w:r>
+      <w:r>
+        <w:rPr>
+          <w:rFonts w:ascii="Consolas" w:hAnsi="Consolas"/>
+          <w:sz w:val="19"/>
+        </w:rPr>
+        <w:t>patient_access_restored</w:t>
+      </w:r>
+      <w:r>
+        <w:rPr>
+          <w:rFonts w:ascii="Times New Roman" w:hAnsi="Times New Roman"/>
+          <w:sz w:val="21"/>
+        </w:rPr>
+        <w:t xml:space="preserve"> is met at T+15 in the ungoverned run and unmet in the governed run; no live repair was run, so there is no live repair result to set against T+15, and scripted and live numbers are not compared. CascadeGuard's answer: the live speed came from </w:t>
+      </w:r>
+      <w:r>
+        <w:rPr>
+          <w:rFonts w:ascii="Consolas" w:hAnsi="Consolas"/>
+          <w:sz w:val="19"/>
+        </w:rPr>
+        <w:t>activate_fallback_channel</w:t>
+      </w:r>
+      <w:r>
+        <w:rPr>
+          <w:rFonts w:ascii="Times New Roman" w:hAnsi="Times New Roman"/>
+          <w:sz w:val="21"/>
+        </w:rPr>
+        <w:t xml:space="preserve"> applied without the authority the governed engine requires. The engine makes that visible as a diagnosed orphan duty (</w:t>
+      </w:r>
+      <w:r>
+        <w:rPr>
+          <w:rFonts w:ascii="Consolas" w:hAnsi="Consolas"/>
+          <w:sz w:val="19"/>
+        </w:rPr>
         <w:t>orphan_duty:activate_fallback_channel</w:t>
       </w:r>
       <w:r>
@@ -2404,7 +2481,7 @@
           <w:rFonts w:ascii="Times New Roman" w:hAnsi="Times New Roman"/>
           <w:sz w:val="21"/>
         </w:rPr>
-        <w:t>) and proposes a repair that restores access with the checks in force; that repair needs human and institutional approval, and two of its blockers remain masked.</w:t>
+        <w:t>) and, with scripted agents (not tested with live agents), proposes a repair that restores access with the checks in force; that repair needs human and institutional approval, and two of its blockers remain masked, cause still present.</w:t>
       </w:r>
     </w:p>
     <w:p>
@@ -2438,7 +2515,7 @@
           <w:rFonts w:ascii="Times New Roman" w:hAnsi="Times New Roman"/>
           <w:sz w:val="21"/>
         </w:rPr>
-        <w:t>Each item is a candidate gap for expert review, not a confirmed legal or standards gap. Examples are from the reviewed mapping (gate 7, 2026-10-31); international and foreign texts are not binding.</w:t>
+        <w:t>Each item is a candidate gap for expert review, not a confirmed legal or standards gap. Examples are from the reviewed mapping (gate 7, 2026-10-31); international and foreign texts are not binding. Repairs are hypothetical rules, not source clauses, tested with scripted agents; each needs human and institutional approval.</w:t>
       </w:r>
     </w:p>
     <w:p>
@@ -2592,7 +2669,7 @@
           <w:rFonts w:ascii="Times New Roman" w:hAnsi="Times New Roman"/>
           <w:sz w:val="21"/>
         </w:rPr>
-        <w:t>, binding unknown); it requires a determination. No reviewed example clause is mapped to this failure. The rank-1 repair only masks it: it stays open for the authorities.</w:t>
+        <w:t>, binding unknown); it requires a determination. No reviewed example clause is mapped to this failure. The rank-1 repair only masks it: it stays open for the authorities to determine.</w:t>
       </w:r>
     </w:p>
     <w:p>
@@ -2648,7 +2725,7 @@
           <w:rFonts w:ascii="Times New Roman" w:hAnsi="Times New Roman"/>
           <w:sz w:val="21"/>
         </w:rPr>
-        <w:t>, which state oversight but set no trigger for review. The rank-1 repair only masks it: it stays open for the authorities.</w:t>
+        <w:t>, which state oversight but set no trigger for review. The rank-1 repair only masks it: it stays open for the authorities to determine.</w:t>
       </w:r>
     </w:p>
     <w:p>
@@ -2660,7 +2737,7 @@
           <w:rFonts w:ascii="Times New Roman" w:hAnsi="Times New Roman"/>
           <w:sz w:val="21"/>
         </w:rPr>
-        <w:t>The two masked items are the strongest gaps in this report: the incident can be resolved in replay without settling who may activate a fallback channel or what triggers a review of an automated lockout.</w:t>
+        <w:t>The two masked items are the candidate gaps the rank-1 repair leaves open: in the scripted replay the incident resolves without settling who may activate a fallback channel or what triggers a review of an automated lockout. Both need expert review.</w:t>
       </w:r>
     </w:p>
     <w:p>

</xml_diff>

<commit_message>
Report: evidence-auditor round 2 MINORs (labels, translation note, dimension count, trigger paraphrase)
Co-Authored-By: Claude Opus 5.5 <noreply@anthropic.com>
</commit_message>
<xml_diff>
--- a/docs/report/cascadeguard-report.docx
+++ b/docs/report/cascadeguard-report.docx
@@ -134,7 +134,7 @@
           <w:rFonts w:ascii="Times New Roman" w:hAnsi="Times New Roman"/>
           <w:sz w:val="21"/>
         </w:rPr>
-        <w:t>CascadeGuard finds where AI decisions and institutional rules collide, identifies the smallest safe repair, and replays the same incident to test whether the repair works. Six institutional roles are played by agents (scripted, or a live LLM); a deterministic engine, never an agent, accepts or rejects every proposed action against the loaded clause set: reviewed clauses quoted verbatim from UAE and international documents, and two illustrative scenario rules. It is decision support, not legal interpretation: every diagnosed failure is a candidate gap for expert review, not a confirmed legal or standards gap. The scenario is hypothetical and all data is synthetic.</w:t>
+        <w:t>CascadeGuard finds where AI decisions and institutional rules collide, identifies the smallest safe repair, and replays the same incident to test whether the repair works. Six institutional roles are played by agents (scripted, or a live LLM); a deterministic engine, never an agent, accepts or rejects every proposed action against the loaded clause set: reviewed clauses quoted verbatim from UAE (in English translation), international and foreign documents, and two illustrative scenario rules. It is decision support, not legal interpretation: every diagnosed failure is a candidate gap for expert review, not a confirmed legal or standards gap. The scenario is hypothetical and all data is synthetic.</w:t>
       </w:r>
     </w:p>
     <w:p>
@@ -188,7 +188,7 @@
           <w:rFonts w:ascii="Times New Roman" w:hAnsi="Times New Roman"/>
           <w:sz w:val="21"/>
         </w:rPr>
-        <w:t xml:space="preserve"> The incident crosses two AI systems in two sectors, so a review of either organisation alone sees only half of it. In this hypothetical scenario the health operator needs the network status, but the scenario places it outside the operator's information boundary; no clause in the loaded clause set authorises that share, assigns an owner for reversing the automated lockouts, or triggers a review of an AI alert that may be another organisation's AI error. Each is a candidate gap for expert review, not a confirmed legal or standards gap.</w:t>
+        <w:t xml:space="preserve"> The incident crosses two AI systems in two sectors, so a review of either organisation alone sees only half of it. In this hypothetical scenario the health operator needs the network status, but the scenario places it outside the operator's information boundary; no clause in the loaded clause set authorises that share, assigns an owner for reversing the automated lockouts, or triggers a review of the automated lockouts (which may stem from another organisation's AI error). Each is a candidate gap for expert review, not a confirmed legal or standards gap.</w:t>
       </w:r>
     </w:p>
     <w:p>
@@ -488,7 +488,7 @@
           <w:rFonts w:ascii="Times New Roman" w:hAnsi="Times New Roman"/>
           <w:sz w:val="21"/>
         </w:rPr>
-        <w:t>Y.3172 is used as an architecture pattern for an institutional decision pipeline; CascadeGuard does not deploy ML models into a network. Only the four Readiness 2.0 dimensions the submission audit supports are claimed.</w:t>
+        <w:t>Y.3172 is used as an architecture pattern for an institutional decision pipeline; CascadeGuard does not deploy ML models into a network. Four of the five Readiness 2.0 dimensions the submission audit supports are claimed (AI for Inclusion, partial, is not).</w:t>
       </w:r>
     </w:p>
     <w:tbl>
@@ -1169,7 +1169,7 @@
                 <w:rFonts w:ascii="Times New Roman" w:hAnsi="Times New Roman"/>
                 <w:sz w:val="17"/>
               </w:rPr>
-              <w:t xml:space="preserve"> (prohibitions); </w:t>
+              <w:t xml:space="preserve"> (prohibitions as interpreted, art16 conditional; binding, English translation); </w:t>
             </w:r>
             <w:r>
               <w:rPr>
@@ -2391,7 +2391,21 @@
           <w:rFonts w:ascii="Times New Roman" w:hAnsi="Times New Roman"/>
           <w:sz w:val="21"/>
         </w:rPr>
-        <w:t xml:space="preserve"> applied without the authority the governed engine requires (at T+15, T+60 and T+75). No live repair was run.</w:t>
+        <w:t xml:space="preserve"> applied without the authority the governed engine requires (authority_uncertain: </w:t>
+      </w:r>
+      <w:r>
+        <w:rPr>
+          <w:rFonts w:ascii="Consolas" w:hAnsi="Consolas"/>
+          <w:sz w:val="19"/>
+        </w:rPr>
+        <w:t>dha.pp11.4-18-1</w:t>
+      </w:r>
+      <w:r>
+        <w:rPr>
+          <w:rFonts w:ascii="Times New Roman" w:hAnsi="Times New Roman"/>
+          <w:sz w:val="21"/>
+        </w:rPr>
+        <w:t>, binding unknown; at T+15, T+60 and T+75). No live repair was run.</w:t>
       </w:r>
     </w:p>
     <w:p>

</xml_diff>

<commit_message>
Report: gate-7 wording (scripted-replay qualifier, trigger item open for expert review); keep the team-line alignment fix in the builder
Human gate 7, 2026-10-31: all eight governed-vs-ungoverned sentences approved with two changes:
sentence 5 gains "in this scripted replay where agents do not adapt"; the undefined-trigger item
now says "it stays open for expert review" (the fallback-channel item keeps "for the authorities
to determine"). The builder now leaves the two-line team paragraph unjustified, as in the human's
hand edit 7200509, so a rebuild keeps it. The report test no longer spells out the draft's
filename (test_reports forbids any tracked file naming it); it reads it from CONCLUSION_DRAFT.

Co-Authored-By: Claude Opus 5.5 <noreply@anthropic.com>
</commit_message>
<xml_diff>
--- a/docs/report/cascadeguard-report.docx
+++ b/docs/report/cascadeguard-report.docx
@@ -54,39 +54,13 @@
           <w:rFonts w:ascii="Times New Roman" w:hAnsi="Times New Roman"/>
           <w:b/>
         </w:rPr>
-        <w:t>Team members</w:t>
-      </w:r>
-      <w:r>
-        <w:rPr>
-          <w:rFonts w:ascii="Times New Roman" w:hAnsi="Times New Roman"/>
-          <w:b/>
-        </w:rPr>
-        <w:t>:</w:t>
-      </w:r>
-      <w:r>
-        <w:rPr>
-          <w:rFonts w:ascii="Times New Roman" w:hAnsi="Times New Roman"/>
-          <w:b/>
-        </w:rPr>
-        <w:t xml:space="preserve"> </w:t>
-      </w:r>
-      <w:r>
-        <w:rPr>
-          <w:rFonts w:ascii="Times New Roman" w:hAnsi="Times New Roman"/>
-        </w:rPr>
-        <w:t>Ibrahim</w:t>
-      </w:r>
-      <w:r>
-        <w:rPr>
-          <w:rFonts w:ascii="Times New Roman" w:hAnsi="Times New Roman"/>
-        </w:rPr>
-        <w:t xml:space="preserve"> </w:t>
-      </w:r>
-      <w:r>
-        <w:rPr>
-          <w:rFonts w:ascii="Times New Roman" w:hAnsi="Times New Roman"/>
-        </w:rPr>
-        <w:t>Melhem</w:t>
+        <w:t xml:space="preserve">Team members: </w:t>
+      </w:r>
+      <w:r>
+        <w:rPr>
+          <w:rFonts w:ascii="Times New Roman" w:hAnsi="Times New Roman"/>
+        </w:rPr>
+        <w:t>Ibrahim Melhem</w:t>
       </w:r>
       <w:r>
         <w:br/>
@@ -152,7 +126,7 @@
     </w:p>
     <w:p>
       <w:pPr>
-        <w:spacing w:after="60"/>
+        <w:spacing w:after="60" w:before="0"/>
       </w:pPr>
       <w:r>
         <w:rPr>
@@ -186,7 +160,7 @@
     </w:p>
     <w:p>
       <w:pPr>
-        <w:spacing w:after="60"/>
+        <w:spacing w:after="60" w:before="0"/>
       </w:pPr>
       <w:r>
         <w:rPr>
@@ -198,7 +172,7 @@
     </w:p>
     <w:p>
       <w:pPr>
-        <w:spacing w:after="60"/>
+        <w:spacing w:after="60" w:before="0"/>
       </w:pPr>
       <w:r>
         <w:rPr>
@@ -218,7 +192,7 @@
     </w:p>
     <w:p>
       <w:pPr>
-        <w:spacing w:after="60"/>
+        <w:spacing w:after="60" w:before="0"/>
       </w:pPr>
       <w:r>
         <w:rPr>
@@ -260,7 +234,7 @@
     </w:p>
     <w:p>
       <w:pPr>
-        <w:spacing w:after="60"/>
+        <w:spacing w:after="60" w:before="0"/>
         <w:ind w:left="283" w:hanging="170"/>
       </w:pPr>
       <w:r>
@@ -288,7 +262,7 @@
     </w:p>
     <w:p>
       <w:pPr>
-        <w:spacing w:after="60"/>
+        <w:spacing w:after="60" w:before="0"/>
         <w:ind w:left="283" w:hanging="170"/>
       </w:pPr>
       <w:r>
@@ -316,7 +290,7 @@
     </w:p>
     <w:p>
       <w:pPr>
-        <w:spacing w:after="60"/>
+        <w:spacing w:after="60" w:before="0"/>
         <w:ind w:left="283" w:hanging="170"/>
       </w:pPr>
       <w:r>
@@ -344,7 +318,7 @@
     </w:p>
     <w:p>
       <w:pPr>
-        <w:spacing w:after="60"/>
+        <w:spacing w:after="60" w:before="0"/>
         <w:ind w:left="283" w:hanging="170"/>
       </w:pPr>
       <w:r>
@@ -372,7 +346,7 @@
     </w:p>
     <w:p>
       <w:pPr>
-        <w:spacing w:after="60"/>
+        <w:spacing w:after="60" w:before="0"/>
         <w:ind w:left="283" w:hanging="170"/>
       </w:pPr>
       <w:r>
@@ -380,7 +354,6 @@
           <w:rFonts w:ascii="Times New Roman" w:hAnsi="Times New Roman"/>
           <w:sz w:val="21"/>
         </w:rPr>
-        <w:lastRenderedPageBreak/>
         <w:t xml:space="preserve">• </w:t>
       </w:r>
       <w:r>
@@ -401,7 +374,7 @@
     </w:p>
     <w:p>
       <w:pPr>
-        <w:spacing w:after="60"/>
+        <w:spacing w:after="60" w:before="0"/>
         <w:ind w:left="283" w:hanging="170"/>
       </w:pPr>
       <w:r>
@@ -429,7 +402,7 @@
     </w:p>
     <w:p>
       <w:pPr>
-        <w:spacing w:after="60"/>
+        <w:spacing w:after="60" w:before="0"/>
         <w:ind w:left="283" w:hanging="170"/>
       </w:pPr>
       <w:r>
@@ -457,7 +430,7 @@
     </w:p>
     <w:p>
       <w:pPr>
-        <w:spacing w:after="60"/>
+        <w:spacing w:after="60" w:before="0"/>
         <w:ind w:left="283" w:hanging="170"/>
       </w:pPr>
       <w:r>
@@ -507,7 +480,7 @@
     </w:p>
     <w:p>
       <w:pPr>
-        <w:spacing w:after="60"/>
+        <w:spacing w:after="60" w:before="0"/>
       </w:pPr>
       <w:r>
         <w:rPr>
@@ -549,6 +522,7 @@
           </w:tcPr>
           <w:p>
             <w:pPr>
+              <w:spacing w:after="0"/>
               <w:rPr>
                 <w:rFonts w:ascii="Times New Roman" w:eastAsia="Times New Roman" w:hAnsi="Times New Roman" w:cs="Times New Roman"/>
               </w:rPr>
@@ -572,6 +546,7 @@
           </w:tcPr>
           <w:p>
             <w:pPr>
+              <w:spacing w:after="0"/>
               <w:rPr>
                 <w:rFonts w:ascii="Times New Roman" w:eastAsia="Times New Roman" w:hAnsi="Times New Roman" w:cs="Times New Roman"/>
               </w:rPr>
@@ -594,6 +569,9 @@
             </w:tcMar>
           </w:tcPr>
           <w:p>
+            <w:pPr>
+              <w:spacing w:after="0"/>
+            </w:pPr>
             <w:r>
               <w:rPr>
                 <w:rFonts w:ascii="Times New Roman" w:hAnsi="Times New Roman"/>
@@ -613,6 +591,7 @@
           </w:tcPr>
           <w:p>
             <w:pPr>
+              <w:spacing w:after="0"/>
               <w:rPr>
                 <w:rFonts w:ascii="Times New Roman" w:eastAsia="Times New Roman" w:hAnsi="Times New Roman" w:cs="Times New Roman"/>
               </w:rPr>
@@ -641,6 +620,7 @@
           </w:tcPr>
           <w:p>
             <w:pPr>
+              <w:spacing w:after="0"/>
               <w:rPr>
                 <w:rFonts w:ascii="Times New Roman" w:eastAsia="Times New Roman" w:hAnsi="Times New Roman" w:cs="Times New Roman"/>
               </w:rPr>
@@ -664,6 +644,7 @@
           </w:tcPr>
           <w:p>
             <w:pPr>
+              <w:spacing w:after="0"/>
               <w:rPr>
                 <w:rFonts w:ascii="Times New Roman" w:eastAsia="Times New Roman" w:hAnsi="Times New Roman" w:cs="Times New Roman"/>
               </w:rPr>
@@ -686,6 +667,9 @@
             </w:tcMar>
           </w:tcPr>
           <w:p>
+            <w:pPr>
+              <w:spacing w:after="0"/>
+            </w:pPr>
             <w:r>
               <w:rPr>
                 <w:rFonts w:ascii="Times New Roman" w:hAnsi="Times New Roman"/>
@@ -705,6 +689,7 @@
           </w:tcPr>
           <w:p>
             <w:pPr>
+              <w:spacing w:after="0"/>
               <w:rPr>
                 <w:rFonts w:ascii="Times New Roman" w:eastAsia="Times New Roman" w:hAnsi="Times New Roman" w:cs="Times New Roman"/>
               </w:rPr>
@@ -733,6 +718,7 @@
           </w:tcPr>
           <w:p>
             <w:pPr>
+              <w:spacing w:after="0"/>
               <w:rPr>
                 <w:rFonts w:ascii="Times New Roman" w:eastAsia="Times New Roman" w:hAnsi="Times New Roman" w:cs="Times New Roman"/>
               </w:rPr>
@@ -756,6 +742,7 @@
           </w:tcPr>
           <w:p>
             <w:pPr>
+              <w:spacing w:after="0"/>
               <w:rPr>
                 <w:rFonts w:ascii="Times New Roman" w:eastAsia="Times New Roman" w:hAnsi="Times New Roman" w:cs="Times New Roman"/>
               </w:rPr>
@@ -792,6 +779,9 @@
             </w:tcMar>
           </w:tcPr>
           <w:p>
+            <w:pPr>
+              <w:spacing w:after="0"/>
+            </w:pPr>
             <w:r>
               <w:rPr>
                 <w:rFonts w:ascii="Times New Roman" w:hAnsi="Times New Roman"/>
@@ -811,6 +801,7 @@
           </w:tcPr>
           <w:p>
             <w:pPr>
+              <w:spacing w:after="0"/>
               <w:rPr>
                 <w:rFonts w:ascii="Times New Roman" w:eastAsia="Times New Roman" w:hAnsi="Times New Roman" w:cs="Times New Roman"/>
               </w:rPr>
@@ -839,6 +830,7 @@
           </w:tcPr>
           <w:p>
             <w:pPr>
+              <w:spacing w:after="0"/>
               <w:rPr>
                 <w:rFonts w:ascii="Times New Roman" w:eastAsia="Times New Roman" w:hAnsi="Times New Roman" w:cs="Times New Roman"/>
               </w:rPr>
@@ -862,6 +854,7 @@
           </w:tcPr>
           <w:p>
             <w:pPr>
+              <w:spacing w:after="0"/>
               <w:rPr>
                 <w:rFonts w:ascii="Times New Roman" w:eastAsia="Times New Roman" w:hAnsi="Times New Roman" w:cs="Times New Roman"/>
               </w:rPr>
@@ -884,6 +877,9 @@
             </w:tcMar>
           </w:tcPr>
           <w:p>
+            <w:pPr>
+              <w:spacing w:after="0"/>
+            </w:pPr>
             <w:r>
               <w:rPr>
                 <w:rFonts w:ascii="Times New Roman" w:hAnsi="Times New Roman"/>
@@ -903,6 +899,7 @@
           </w:tcPr>
           <w:p>
             <w:pPr>
+              <w:spacing w:after="0"/>
               <w:rPr>
                 <w:rFonts w:ascii="Times New Roman" w:eastAsia="Times New Roman" w:hAnsi="Times New Roman" w:cs="Times New Roman"/>
               </w:rPr>
@@ -966,6 +963,7 @@
           </w:tcPr>
           <w:p>
             <w:pPr>
+              <w:spacing w:after="0"/>
               <w:rPr>
                 <w:rFonts w:ascii="Times New Roman" w:eastAsia="Times New Roman" w:hAnsi="Times New Roman" w:cs="Times New Roman"/>
               </w:rPr>
@@ -989,6 +987,7 @@
           </w:tcPr>
           <w:p>
             <w:pPr>
+              <w:spacing w:after="0"/>
               <w:rPr>
                 <w:rFonts w:ascii="Times New Roman" w:eastAsia="Times New Roman" w:hAnsi="Times New Roman" w:cs="Times New Roman"/>
               </w:rPr>
@@ -1011,6 +1010,9 @@
             </w:tcMar>
           </w:tcPr>
           <w:p>
+            <w:pPr>
+              <w:spacing w:after="0"/>
+            </w:pPr>
             <w:r>
               <w:rPr>
                 <w:rFonts w:ascii="Times New Roman" w:hAnsi="Times New Roman"/>
@@ -1030,6 +1032,7 @@
           </w:tcPr>
           <w:p>
             <w:pPr>
+              <w:spacing w:after="0"/>
               <w:rPr>
                 <w:rFonts w:ascii="Times New Roman" w:eastAsia="Times New Roman" w:hAnsi="Times New Roman" w:cs="Times New Roman"/>
               </w:rPr>
@@ -1065,6 +1068,7 @@
           </w:tcPr>
           <w:p>
             <w:pPr>
+              <w:spacing w:after="0"/>
               <w:rPr>
                 <w:rFonts w:ascii="Times New Roman" w:eastAsia="Times New Roman" w:hAnsi="Times New Roman" w:cs="Times New Roman"/>
               </w:rPr>
@@ -1088,6 +1092,7 @@
           </w:tcPr>
           <w:p>
             <w:pPr>
+              <w:spacing w:after="0"/>
               <w:rPr>
                 <w:rFonts w:ascii="Times New Roman" w:eastAsia="Times New Roman" w:hAnsi="Times New Roman" w:cs="Times New Roman"/>
               </w:rPr>
@@ -1110,6 +1115,9 @@
             </w:tcMar>
           </w:tcPr>
           <w:p>
+            <w:pPr>
+              <w:spacing w:after="0"/>
+            </w:pPr>
             <w:r>
               <w:rPr>
                 <w:rFonts w:ascii="Times New Roman" w:hAnsi="Times New Roman"/>
@@ -1129,6 +1137,7 @@
           </w:tcPr>
           <w:p>
             <w:pPr>
+              <w:spacing w:after="0"/>
               <w:rPr>
                 <w:rFonts w:ascii="Times New Roman" w:eastAsia="Times New Roman" w:hAnsi="Times New Roman" w:cs="Times New Roman"/>
               </w:rPr>
@@ -1276,6 +1285,7 @@
           </w:tcPr>
           <w:p>
             <w:pPr>
+              <w:spacing w:after="0"/>
               <w:rPr>
                 <w:rFonts w:ascii="Times New Roman" w:eastAsia="Times New Roman" w:hAnsi="Times New Roman" w:cs="Times New Roman"/>
               </w:rPr>
@@ -1299,6 +1309,7 @@
           </w:tcPr>
           <w:p>
             <w:pPr>
+              <w:spacing w:after="0"/>
               <w:rPr>
                 <w:rFonts w:ascii="Times New Roman" w:eastAsia="Times New Roman" w:hAnsi="Times New Roman" w:cs="Times New Roman"/>
               </w:rPr>
@@ -1321,6 +1332,9 @@
             </w:tcMar>
           </w:tcPr>
           <w:p>
+            <w:pPr>
+              <w:spacing w:after="0"/>
+            </w:pPr>
             <w:r>
               <w:rPr>
                 <w:rFonts w:ascii="Times New Roman" w:hAnsi="Times New Roman"/>
@@ -1340,6 +1354,7 @@
           </w:tcPr>
           <w:p>
             <w:pPr>
+              <w:spacing w:after="0"/>
               <w:rPr>
                 <w:rFonts w:ascii="Times New Roman" w:eastAsia="Times New Roman" w:hAnsi="Times New Roman" w:cs="Times New Roman"/>
               </w:rPr>
@@ -1389,6 +1404,7 @@
           </w:tcPr>
           <w:p>
             <w:pPr>
+              <w:spacing w:after="0"/>
               <w:rPr>
                 <w:rFonts w:ascii="Times New Roman" w:eastAsia="Times New Roman" w:hAnsi="Times New Roman" w:cs="Times New Roman"/>
               </w:rPr>
@@ -1412,6 +1428,7 @@
           </w:tcPr>
           <w:p>
             <w:pPr>
+              <w:spacing w:after="0"/>
               <w:rPr>
                 <w:rFonts w:ascii="Times New Roman" w:eastAsia="Times New Roman" w:hAnsi="Times New Roman" w:cs="Times New Roman"/>
               </w:rPr>
@@ -1434,6 +1451,9 @@
             </w:tcMar>
           </w:tcPr>
           <w:p>
+            <w:pPr>
+              <w:spacing w:after="0"/>
+            </w:pPr>
             <w:r>
               <w:rPr>
                 <w:rFonts w:ascii="Times New Roman" w:hAnsi="Times New Roman"/>
@@ -1453,6 +1473,7 @@
           </w:tcPr>
           <w:p>
             <w:pPr>
+              <w:spacing w:after="0"/>
               <w:rPr>
                 <w:rFonts w:ascii="Times New Roman" w:eastAsia="Times New Roman" w:hAnsi="Times New Roman" w:cs="Times New Roman"/>
               </w:rPr>
@@ -1544,6 +1565,7 @@
           </w:tcPr>
           <w:p>
             <w:pPr>
+              <w:spacing w:after="0"/>
               <w:rPr>
                 <w:rFonts w:ascii="Times New Roman" w:eastAsia="Times New Roman" w:hAnsi="Times New Roman" w:cs="Times New Roman"/>
               </w:rPr>
@@ -1567,6 +1589,7 @@
           </w:tcPr>
           <w:p>
             <w:pPr>
+              <w:spacing w:after="0"/>
               <w:rPr>
                 <w:rFonts w:ascii="Times New Roman" w:eastAsia="Times New Roman" w:hAnsi="Times New Roman" w:cs="Times New Roman"/>
               </w:rPr>
@@ -1589,6 +1612,9 @@
             </w:tcMar>
           </w:tcPr>
           <w:p>
+            <w:pPr>
+              <w:spacing w:after="0"/>
+            </w:pPr>
             <w:r>
               <w:rPr>
                 <w:rFonts w:ascii="Times New Roman" w:hAnsi="Times New Roman"/>
@@ -1608,6 +1634,7 @@
           </w:tcPr>
           <w:p>
             <w:pPr>
+              <w:spacing w:after="0"/>
               <w:rPr>
                 <w:rFonts w:ascii="Times New Roman" w:eastAsia="Times New Roman" w:hAnsi="Times New Roman" w:cs="Times New Roman"/>
               </w:rPr>
@@ -1636,6 +1663,7 @@
           </w:tcPr>
           <w:p>
             <w:pPr>
+              <w:spacing w:after="0"/>
               <w:rPr>
                 <w:rFonts w:ascii="Times New Roman" w:eastAsia="Times New Roman" w:hAnsi="Times New Roman" w:cs="Times New Roman"/>
               </w:rPr>
@@ -1659,6 +1687,7 @@
           </w:tcPr>
           <w:p>
             <w:pPr>
+              <w:spacing w:after="0"/>
               <w:rPr>
                 <w:rFonts w:ascii="Times New Roman" w:eastAsia="Times New Roman" w:hAnsi="Times New Roman" w:cs="Times New Roman"/>
               </w:rPr>
@@ -1681,6 +1710,9 @@
             </w:tcMar>
           </w:tcPr>
           <w:p>
+            <w:pPr>
+              <w:spacing w:after="0"/>
+            </w:pPr>
             <w:r>
               <w:rPr>
                 <w:rFonts w:ascii="Times New Roman" w:hAnsi="Times New Roman"/>
@@ -1700,6 +1732,7 @@
           </w:tcPr>
           <w:p>
             <w:pPr>
+              <w:spacing w:after="0"/>
               <w:rPr>
                 <w:rFonts w:ascii="Times New Roman" w:eastAsia="Times New Roman" w:hAnsi="Times New Roman" w:cs="Times New Roman"/>
               </w:rPr>
@@ -1717,7 +1750,7 @@
     </w:tbl>
     <w:p>
       <w:pPr>
-        <w:spacing w:after="60"/>
+        <w:spacing w:after="60" w:before="0"/>
       </w:pPr>
       <w:r>
         <w:rPr>
@@ -1751,7 +1784,7 @@
     </w:p>
     <w:p>
       <w:pPr>
-        <w:spacing w:after="60"/>
+        <w:spacing w:after="60" w:before="0"/>
       </w:pPr>
       <w:r>
         <w:rPr>
@@ -1759,7 +1792,6 @@
           <w:b/>
           <w:sz w:val="21"/>
         </w:rPr>
-        <w:lastRenderedPageBreak/>
         <w:t>Baseline (scripted agents).</w:t>
       </w:r>
       <w:r>
@@ -1843,21 +1875,24 @@
     <w:tbl>
       <w:tblPr>
         <w:tblStyle w:val="TableGridLight"/>
-        <w:tblW w:w="0" w:type="auto"/>
-        <w:tblLook w:val="04A0" w:firstRow="1" w:lastRow="0" w:firstColumn="1" w:lastColumn="0" w:noHBand="0" w:noVBand="1"/>
+        <w:tblW w:type="auto" w:w="0"/>
+        <w:tblLook w:firstColumn="1" w:firstRow="1" w:lastColumn="0" w:lastRow="0" w:noHBand="0" w:noVBand="1" w:val="04A0"/>
       </w:tblPr>
       <w:tblGrid>
-        <w:gridCol w:w="2292"/>
-        <w:gridCol w:w="2331"/>
-        <w:gridCol w:w="2443"/>
-        <w:gridCol w:w="2284"/>
+        <w:gridCol w:w="2340"/>
+        <w:gridCol w:w="2340"/>
+        <w:gridCol w:w="2340"/>
+        <w:gridCol w:w="2340"/>
       </w:tblGrid>
       <w:tr>
         <w:tc>
           <w:tcPr>
-            <w:tcW w:w="2340" w:type="dxa"/>
-          </w:tcPr>
-          <w:p>
+            <w:tcW w:type="dxa" w:w="2340"/>
+          </w:tcPr>
+          <w:p>
+            <w:pPr>
+              <w:spacing w:after="0"/>
+            </w:pPr>
             <w:r>
               <w:rPr>
                 <w:rFonts w:ascii="Times New Roman" w:hAnsi="Times New Roman"/>
@@ -1869,9 +1904,12 @@
         </w:tc>
         <w:tc>
           <w:tcPr>
-            <w:tcW w:w="2340" w:type="dxa"/>
-          </w:tcPr>
-          <w:p>
+            <w:tcW w:type="dxa" w:w="2340"/>
+          </w:tcPr>
+          <w:p>
+            <w:pPr>
+              <w:spacing w:after="0"/>
+            </w:pPr>
             <w:r>
               <w:rPr>
                 <w:rFonts w:ascii="Consolas" w:hAnsi="Consolas"/>
@@ -1883,9 +1921,12 @@
         </w:tc>
         <w:tc>
           <w:tcPr>
-            <w:tcW w:w="2340" w:type="dxa"/>
-          </w:tcPr>
-          <w:p>
+            <w:tcW w:type="dxa" w:w="2340"/>
+          </w:tcPr>
+          <w:p>
+            <w:pPr>
+              <w:spacing w:after="0"/>
+            </w:pPr>
             <w:r>
               <w:rPr>
                 <w:rFonts w:ascii="Consolas" w:hAnsi="Consolas"/>
@@ -1897,9 +1938,12 @@
         </w:tc>
         <w:tc>
           <w:tcPr>
-            <w:tcW w:w="2340" w:type="dxa"/>
-          </w:tcPr>
-          <w:p>
+            <w:tcW w:type="dxa" w:w="2340"/>
+          </w:tcPr>
+          <w:p>
+            <w:pPr>
+              <w:spacing w:after="0"/>
+            </w:pPr>
             <w:r>
               <w:rPr>
                 <w:rFonts w:ascii="Times New Roman" w:hAnsi="Times New Roman"/>
@@ -1913,9 +1957,12 @@
       <w:tr>
         <w:tc>
           <w:tcPr>
-            <w:tcW w:w="2340" w:type="dxa"/>
-          </w:tcPr>
-          <w:p>
+            <w:tcW w:type="dxa" w:w="2340"/>
+          </w:tcPr>
+          <w:p>
+            <w:pPr>
+              <w:spacing w:after="0"/>
+            </w:pPr>
             <w:r>
               <w:rPr>
                 <w:rFonts w:ascii="Times New Roman" w:hAnsi="Times New Roman"/>
@@ -1927,9 +1974,12 @@
         </w:tc>
         <w:tc>
           <w:tcPr>
-            <w:tcW w:w="2340" w:type="dxa"/>
-          </w:tcPr>
-          <w:p>
+            <w:tcW w:type="dxa" w:w="2340"/>
+          </w:tcPr>
+          <w:p>
+            <w:pPr>
+              <w:spacing w:after="0"/>
+            </w:pPr>
             <w:r>
               <w:rPr>
                 <w:rFonts w:ascii="Times New Roman" w:hAnsi="Times New Roman"/>
@@ -1941,9 +1991,12 @@
         </w:tc>
         <w:tc>
           <w:tcPr>
-            <w:tcW w:w="2340" w:type="dxa"/>
-          </w:tcPr>
-          <w:p>
+            <w:tcW w:type="dxa" w:w="2340"/>
+          </w:tcPr>
+          <w:p>
+            <w:pPr>
+              <w:spacing w:after="0"/>
+            </w:pPr>
             <w:r>
               <w:rPr>
                 <w:rFonts w:ascii="Times New Roman" w:hAnsi="Times New Roman"/>
@@ -1955,9 +2008,12 @@
         </w:tc>
         <w:tc>
           <w:tcPr>
-            <w:tcW w:w="2340" w:type="dxa"/>
-          </w:tcPr>
-          <w:p>
+            <w:tcW w:type="dxa" w:w="2340"/>
+          </w:tcPr>
+          <w:p>
+            <w:pPr>
+              <w:spacing w:after="0"/>
+            </w:pPr>
             <w:r>
               <w:rPr>
                 <w:rFonts w:ascii="Times New Roman" w:hAnsi="Times New Roman"/>
@@ -1971,9 +2027,12 @@
       <w:tr>
         <w:tc>
           <w:tcPr>
-            <w:tcW w:w="2340" w:type="dxa"/>
-          </w:tcPr>
-          <w:p>
+            <w:tcW w:type="dxa" w:w="2340"/>
+          </w:tcPr>
+          <w:p>
+            <w:pPr>
+              <w:spacing w:after="0"/>
+            </w:pPr>
             <w:r>
               <w:rPr>
                 <w:rFonts w:ascii="Times New Roman" w:hAnsi="Times New Roman"/>
@@ -1985,9 +2044,12 @@
         </w:tc>
         <w:tc>
           <w:tcPr>
-            <w:tcW w:w="2340" w:type="dxa"/>
-          </w:tcPr>
-          <w:p>
+            <w:tcW w:type="dxa" w:w="2340"/>
+          </w:tcPr>
+          <w:p>
+            <w:pPr>
+              <w:spacing w:after="0"/>
+            </w:pPr>
             <w:r>
               <w:rPr>
                 <w:rFonts w:ascii="Times New Roman" w:hAnsi="Times New Roman"/>
@@ -1999,9 +2061,12 @@
         </w:tc>
         <w:tc>
           <w:tcPr>
-            <w:tcW w:w="2340" w:type="dxa"/>
-          </w:tcPr>
-          <w:p>
+            <w:tcW w:type="dxa" w:w="2340"/>
+          </w:tcPr>
+          <w:p>
+            <w:pPr>
+              <w:spacing w:after="0"/>
+            </w:pPr>
             <w:r>
               <w:rPr>
                 <w:rFonts w:ascii="Times New Roman" w:hAnsi="Times New Roman"/>
@@ -2013,9 +2078,12 @@
         </w:tc>
         <w:tc>
           <w:tcPr>
-            <w:tcW w:w="2340" w:type="dxa"/>
-          </w:tcPr>
-          <w:p>
+            <w:tcW w:type="dxa" w:w="2340"/>
+          </w:tcPr>
+          <w:p>
+            <w:pPr>
+              <w:spacing w:after="0"/>
+            </w:pPr>
             <w:r>
               <w:rPr>
                 <w:rFonts w:ascii="Times New Roman" w:hAnsi="Times New Roman"/>
@@ -2029,9 +2097,12 @@
       <w:tr>
         <w:tc>
           <w:tcPr>
-            <w:tcW w:w="2340" w:type="dxa"/>
-          </w:tcPr>
-          <w:p>
+            <w:tcW w:type="dxa" w:w="2340"/>
+          </w:tcPr>
+          <w:p>
+            <w:pPr>
+              <w:spacing w:after="0"/>
+            </w:pPr>
             <w:r>
               <w:rPr>
                 <w:rFonts w:ascii="Times New Roman" w:hAnsi="Times New Roman"/>
@@ -2043,9 +2114,12 @@
         </w:tc>
         <w:tc>
           <w:tcPr>
-            <w:tcW w:w="2340" w:type="dxa"/>
-          </w:tcPr>
-          <w:p>
+            <w:tcW w:type="dxa" w:w="2340"/>
+          </w:tcPr>
+          <w:p>
+            <w:pPr>
+              <w:spacing w:after="0"/>
+            </w:pPr>
             <w:r>
               <w:rPr>
                 <w:rFonts w:ascii="Times New Roman" w:hAnsi="Times New Roman"/>
@@ -2057,9 +2131,12 @@
         </w:tc>
         <w:tc>
           <w:tcPr>
-            <w:tcW w:w="2340" w:type="dxa"/>
-          </w:tcPr>
-          <w:p>
+            <w:tcW w:type="dxa" w:w="2340"/>
+          </w:tcPr>
+          <w:p>
+            <w:pPr>
+              <w:spacing w:after="0"/>
+            </w:pPr>
             <w:r>
               <w:rPr>
                 <w:rFonts w:ascii="Times New Roman" w:hAnsi="Times New Roman"/>
@@ -2071,9 +2148,12 @@
         </w:tc>
         <w:tc>
           <w:tcPr>
-            <w:tcW w:w="2340" w:type="dxa"/>
-          </w:tcPr>
-          <w:p>
+            <w:tcW w:type="dxa" w:w="2340"/>
+          </w:tcPr>
+          <w:p>
+            <w:pPr>
+              <w:spacing w:after="0"/>
+            </w:pPr>
             <w:r>
               <w:rPr>
                 <w:rFonts w:ascii="Times New Roman" w:hAnsi="Times New Roman"/>
@@ -2087,7 +2167,7 @@
     </w:tbl>
     <w:p>
       <w:pPr>
-        <w:spacing w:after="60"/>
+        <w:spacing w:after="60" w:before="0"/>
       </w:pPr>
       <w:r>
         <w:rPr>
@@ -2177,7 +2257,7 @@
     </w:p>
     <w:p>
       <w:pPr>
-        <w:spacing w:after="60"/>
+        <w:spacing w:after="60" w:before="0"/>
       </w:pPr>
       <w:r>
         <w:rPr>
@@ -2267,7 +2347,7 @@
     </w:p>
     <w:p>
       <w:pPr>
-        <w:spacing w:after="60"/>
+        <w:spacing w:after="60" w:before="0"/>
       </w:pPr>
       <w:r>
         <w:rPr>
@@ -2329,7 +2409,7 @@
     </w:p>
     <w:p>
       <w:pPr>
-        <w:spacing w:after="60"/>
+        <w:spacing w:after="60" w:before="0"/>
       </w:pPr>
       <w:r>
         <w:rPr>
@@ -2358,7 +2438,7 @@
           <w:rFonts w:ascii="Times New Roman" w:hAnsi="Times New Roman"/>
           <w:sz w:val="21"/>
         </w:rPr>
-        <w:t xml:space="preserve"> at T+60, with the same scripted decisions: here governance with the repair costs no time, and only the repair run also meets </w:t>
+        <w:t xml:space="preserve"> at T+60, with the same scripted decisions: here, in this scripted replay where agents do not adapt, governance with the repair costs no time, and only the repair run also meets </w:t>
       </w:r>
       <w:r>
         <w:rPr>
@@ -2441,7 +2521,7 @@
     </w:p>
     <w:p>
       <w:pPr>
-        <w:spacing w:after="60"/>
+        <w:spacing w:after="60" w:before="0"/>
       </w:pPr>
       <w:r>
         <w:rPr>
@@ -2453,7 +2533,7 @@
     </w:p>
     <w:p>
       <w:pPr>
-        <w:spacing w:after="60"/>
+        <w:spacing w:after="60" w:before="0"/>
         <w:ind w:left="283" w:hanging="170"/>
       </w:pPr>
       <w:r>
@@ -2495,7 +2575,7 @@
     </w:p>
     <w:p>
       <w:pPr>
-        <w:spacing w:after="60"/>
+        <w:spacing w:after="60" w:before="0"/>
         <w:ind w:left="283" w:hanging="170"/>
       </w:pPr>
       <w:r>
@@ -2503,7 +2583,6 @@
           <w:rFonts w:ascii="Times New Roman" w:hAnsi="Times New Roman"/>
           <w:sz w:val="21"/>
         </w:rPr>
-        <w:lastRenderedPageBreak/>
         <w:t xml:space="preserve">• </w:t>
       </w:r>
       <w:r>
@@ -2566,7 +2645,7 @@
     </w:p>
     <w:p>
       <w:pPr>
-        <w:spacing w:after="60"/>
+        <w:spacing w:after="60" w:before="0"/>
         <w:ind w:left="283" w:hanging="170"/>
       </w:pPr>
       <w:r>
@@ -2608,7 +2687,7 @@
     </w:p>
     <w:p>
       <w:pPr>
-        <w:spacing w:after="60"/>
+        <w:spacing w:after="60" w:before="0"/>
         <w:ind w:left="283" w:hanging="170"/>
       </w:pPr>
       <w:r>
@@ -2659,12 +2738,12 @@
           <w:rFonts w:ascii="Times New Roman" w:hAnsi="Times New Roman"/>
           <w:sz w:val="21"/>
         </w:rPr>
-        <w:t>, which state oversight but set no trigger for review. The rank-1 repair only masks it: it stays open for the authorities to determine.</w:t>
+        <w:t>, which state oversight but set no trigger for review. The rank-1 repair only masks it: it stays open for expert review.</w:t>
       </w:r>
     </w:p>
     <w:p>
       <w:pPr>
-        <w:spacing w:after="60"/>
+        <w:spacing w:after="60" w:before="0"/>
       </w:pPr>
       <w:r>
         <w:rPr>
@@ -2676,7 +2755,7 @@
     </w:p>
     <w:p>
       <w:pPr>
-        <w:spacing w:after="60"/>
+        <w:spacing w:after="60" w:before="0"/>
       </w:pPr>
       <w:r>
         <w:rPr>

</xml_diff>

<commit_message>
Report: phase-auditor round 1 fixes (PDF currency test, labels, PROGRESS, structure file)
- The PDF test now checks every Markdown paragraph and bullet word for word in the PDF text
  (whitespace and hyphen line breaks normalised; table cells are left to the .docx test), so a
  stale export fails. It fails now until the human re-exports the PDF from this .docx.
- Section 4 labels: art2 and pdpl art2-2 are labelled binding (English translation) on their own,
  so 'binding unknown' attaches only to dha.pp11.applicability; art6 gets its label.
- PROGRESS: the technical report entry (gate 3 python-docx dev-only approval, gate 7 approval and
  its two changes, published form, Done when, verify commands, reviews) and the next step.
- Structure file: docs/report/, scripts/report_docx.py, scripts/export_report_pdf.ps1.
- report_docx.py: says the organizers' template is read from outside the repository.

Co-Authored-By: Claude Opus 5.5 <noreply@anthropic.com>
</commit_message>
<xml_diff>
--- a/docs/report/cascadeguard-report.docx
+++ b/docs/report/cascadeguard-report.docx
@@ -930,7 +930,7 @@
                 <w:rFonts w:ascii="Times New Roman" w:hAnsi="Times New Roman"/>
                 <w:sz w:val="17"/>
               </w:rPr>
-              <w:t xml:space="preserve">, </w:t>
+              <w:t xml:space="preserve"> (binding, English translation); </w:t>
             </w:r>
             <w:r>
               <w:rPr>
@@ -1182,7 +1182,7 @@
                 <w:rFonts w:ascii="Times New Roman" w:hAnsi="Times New Roman"/>
                 <w:sz w:val="17"/>
               </w:rPr>
-              <w:t xml:space="preserve">; </w:t>
+              <w:t xml:space="preserve"> (binding, English translation); </w:t>
             </w:r>
             <w:r>
               <w:rPr>

</xml_diff>

<commit_message>
Report: A4 page size, tables scaled to the A4 text width, section-6 pointer in section 2
Human decisions 2026-11-01: add "(see section 6)" to the "Gaps in existing approaches" sentence
(no other wording change); switch the .docx from the template's US Letter to A4, margins kept.
The A4 text width (9026 twips) is narrower than the template's fixed 9359-twip mapping table, so
the builder scales every table's grid and cell widths to the text width. New test: the .docx is
A4 and its tables fit the margins; the PDF test now also requires A4 pages, so it fails until the
human re-exports the PDF from this .docx.

Co-Authored-By: Claude Opus 5.5 <noreply@anthropic.com>
</commit_message>
<xml_diff>
--- a/docs/report/cascadeguard-report.docx
+++ b/docs/report/cascadeguard-report.docx
@@ -187,7 +187,7 @@
           <w:rFonts w:ascii="Times New Roman" w:hAnsi="Times New Roman"/>
           <w:sz w:val="21"/>
         </w:rPr>
-        <w:t xml:space="preserve"> The incident crosses two AI systems in two sectors, so a review of either organisation alone sees only half of it. In this hypothetical scenario the health operator needs the network status, but the scenario places it outside the operator's information boundary; no clause in the loaded clause set authorises that share, assigns an owner for reversing the automated lockouts, or triggers a review of the automated lockouts (which may stem from another organisation's AI error). Each is a candidate gap for expert review, not a confirmed legal or standards gap.</w:t>
+        <w:t xml:space="preserve"> The incident crosses two AI systems in two sectors, so a review of either organisation alone sees only half of it. In this hypothetical scenario the health operator needs the network status, but the scenario places it outside the operator's information boundary; no clause in the loaded clause set authorises that share, assigns an owner for reversing the automated lockouts, or triggers a review of the automated lockouts (which may stem from another organisation's AI error) (see section 6). Each is a candidate gap for expert review, not a confirmed legal or standards gap.</w:t>
       </w:r>
     </w:p>
     <w:p>
@@ -493,7 +493,7 @@
     <w:tbl>
       <w:tblPr>
         <w:tblStyle w:val="TableGridLight"/>
-        <w:tblW w:w="9359" w:type="dxa"/>
+        <w:tblW w:w="9026" w:type="dxa"/>
         <w:tblBorders>
           <w:top w:val="single" w:sz="6" w:space="0" w:color="auto"/>
           <w:left w:val="single" w:sz="6" w:space="0" w:color="auto"/>
@@ -503,10 +503,10 @@
         <w:tblLook w:val="0420" w:firstRow="1" w:lastRow="0" w:firstColumn="0" w:lastColumn="0" w:noHBand="0" w:noVBand="1"/>
       </w:tblPr>
       <w:tblGrid>
-        <w:gridCol w:w="1541"/>
-        <w:gridCol w:w="2300"/>
-        <w:gridCol w:w="2300"/>
-        <w:gridCol w:w="3218"/>
+        <w:gridCol w:w="1486"/>
+        <w:gridCol w:w="2218"/>
+        <w:gridCol w:w="2218"/>
+        <w:gridCol w:w="3104"/>
       </w:tblGrid>
       <w:tr>
         <w:trPr>
@@ -514,7 +514,7 @@
         </w:trPr>
         <w:tc>
           <w:tcPr>
-            <w:tcW w:w="1541" w:type="dxa"/>
+            <w:tcW w:w="1486" w:type="dxa"/>
             <w:tcMar>
               <w:left w:w="105" w:type="dxa"/>
               <w:right w:w="105" w:type="dxa"/>
@@ -538,7 +538,7 @@
         </w:tc>
         <w:tc>
           <w:tcPr>
-            <w:tcW w:w="2300" w:type="dxa"/>
+            <w:tcW w:w="2218" w:type="dxa"/>
             <w:tcMar>
               <w:left w:w="105" w:type="dxa"/>
               <w:right w:w="105" w:type="dxa"/>
@@ -562,7 +562,7 @@
         </w:tc>
         <w:tc>
           <w:tcPr>
-            <w:tcW w:w="2300" w:type="dxa"/>
+            <w:tcW w:w="2218" w:type="dxa"/>
             <w:tcMar>
               <w:left w:w="105" w:type="dxa"/>
               <w:right w:w="105" w:type="dxa"/>
@@ -583,7 +583,7 @@
         </w:tc>
         <w:tc>
           <w:tcPr>
-            <w:tcW w:w="3218" w:type="dxa"/>
+            <w:tcW w:w="3104" w:type="dxa"/>
             <w:tcMar>
               <w:left w:w="105" w:type="dxa"/>
               <w:right w:w="105" w:type="dxa"/>
@@ -612,7 +612,7 @@
         </w:trPr>
         <w:tc>
           <w:tcPr>
-            <w:tcW w:w="1541" w:type="dxa"/>
+            <w:tcW w:w="1486" w:type="dxa"/>
             <w:tcMar>
               <w:left w:w="105" w:type="dxa"/>
               <w:right w:w="105" w:type="dxa"/>
@@ -636,7 +636,7 @@
         </w:tc>
         <w:tc>
           <w:tcPr>
-            <w:tcW w:w="2300" w:type="dxa"/>
+            <w:tcW w:w="2218" w:type="dxa"/>
             <w:tcMar>
               <w:left w:w="105" w:type="dxa"/>
               <w:right w:w="105" w:type="dxa"/>
@@ -660,7 +660,7 @@
         </w:tc>
         <w:tc>
           <w:tcPr>
-            <w:tcW w:w="2300" w:type="dxa"/>
+            <w:tcW w:w="2218" w:type="dxa"/>
             <w:tcMar>
               <w:left w:w="105" w:type="dxa"/>
               <w:right w:w="105" w:type="dxa"/>
@@ -681,7 +681,7 @@
         </w:tc>
         <w:tc>
           <w:tcPr>
-            <w:tcW w:w="3218" w:type="dxa"/>
+            <w:tcW w:w="3104" w:type="dxa"/>
             <w:tcMar>
               <w:left w:w="105" w:type="dxa"/>
               <w:right w:w="105" w:type="dxa"/>
@@ -710,7 +710,7 @@
         </w:trPr>
         <w:tc>
           <w:tcPr>
-            <w:tcW w:w="1541" w:type="dxa"/>
+            <w:tcW w:w="1486" w:type="dxa"/>
             <w:tcMar>
               <w:left w:w="105" w:type="dxa"/>
               <w:right w:w="105" w:type="dxa"/>
@@ -734,7 +734,7 @@
         </w:tc>
         <w:tc>
           <w:tcPr>
-            <w:tcW w:w="2300" w:type="dxa"/>
+            <w:tcW w:w="2218" w:type="dxa"/>
             <w:tcMar>
               <w:left w:w="105" w:type="dxa"/>
               <w:right w:w="105" w:type="dxa"/>
@@ -772,7 +772,7 @@
         </w:tc>
         <w:tc>
           <w:tcPr>
-            <w:tcW w:w="2300" w:type="dxa"/>
+            <w:tcW w:w="2218" w:type="dxa"/>
             <w:tcMar>
               <w:left w:w="105" w:type="dxa"/>
               <w:right w:w="105" w:type="dxa"/>
@@ -793,7 +793,7 @@
         </w:tc>
         <w:tc>
           <w:tcPr>
-            <w:tcW w:w="3218" w:type="dxa"/>
+            <w:tcW w:w="3104" w:type="dxa"/>
             <w:tcMar>
               <w:left w:w="105" w:type="dxa"/>
               <w:right w:w="105" w:type="dxa"/>
@@ -822,7 +822,7 @@
         </w:trPr>
         <w:tc>
           <w:tcPr>
-            <w:tcW w:w="1541" w:type="dxa"/>
+            <w:tcW w:w="1486" w:type="dxa"/>
             <w:tcMar>
               <w:left w:w="105" w:type="dxa"/>
               <w:right w:w="105" w:type="dxa"/>
@@ -846,7 +846,7 @@
         </w:tc>
         <w:tc>
           <w:tcPr>
-            <w:tcW w:w="2300" w:type="dxa"/>
+            <w:tcW w:w="2218" w:type="dxa"/>
             <w:tcMar>
               <w:left w:w="105" w:type="dxa"/>
               <w:right w:w="105" w:type="dxa"/>
@@ -870,7 +870,7 @@
         </w:tc>
         <w:tc>
           <w:tcPr>
-            <w:tcW w:w="2300" w:type="dxa"/>
+            <w:tcW w:w="2218" w:type="dxa"/>
             <w:tcMar>
               <w:left w:w="105" w:type="dxa"/>
               <w:right w:w="105" w:type="dxa"/>
@@ -891,7 +891,7 @@
         </w:tc>
         <w:tc>
           <w:tcPr>
-            <w:tcW w:w="3218" w:type="dxa"/>
+            <w:tcW w:w="3104" w:type="dxa"/>
             <w:tcMar>
               <w:left w:w="105" w:type="dxa"/>
               <w:right w:w="105" w:type="dxa"/>
@@ -955,7 +955,7 @@
         </w:trPr>
         <w:tc>
           <w:tcPr>
-            <w:tcW w:w="1541" w:type="dxa"/>
+            <w:tcW w:w="1486" w:type="dxa"/>
             <w:tcMar>
               <w:left w:w="105" w:type="dxa"/>
               <w:right w:w="105" w:type="dxa"/>
@@ -979,7 +979,7 @@
         </w:tc>
         <w:tc>
           <w:tcPr>
-            <w:tcW w:w="2300" w:type="dxa"/>
+            <w:tcW w:w="2218" w:type="dxa"/>
             <w:tcMar>
               <w:left w:w="105" w:type="dxa"/>
               <w:right w:w="105" w:type="dxa"/>
@@ -1003,7 +1003,7 @@
         </w:tc>
         <w:tc>
           <w:tcPr>
-            <w:tcW w:w="2300" w:type="dxa"/>
+            <w:tcW w:w="2218" w:type="dxa"/>
             <w:tcMar>
               <w:left w:w="105" w:type="dxa"/>
               <w:right w:w="105" w:type="dxa"/>
@@ -1024,7 +1024,7 @@
         </w:tc>
         <w:tc>
           <w:tcPr>
-            <w:tcW w:w="3218" w:type="dxa"/>
+            <w:tcW w:w="3104" w:type="dxa"/>
             <w:tcMar>
               <w:left w:w="105" w:type="dxa"/>
               <w:right w:w="105" w:type="dxa"/>
@@ -1060,7 +1060,7 @@
         </w:trPr>
         <w:tc>
           <w:tcPr>
-            <w:tcW w:w="1541" w:type="dxa"/>
+            <w:tcW w:w="1486" w:type="dxa"/>
             <w:tcMar>
               <w:left w:w="105" w:type="dxa"/>
               <w:right w:w="105" w:type="dxa"/>
@@ -1084,7 +1084,7 @@
         </w:tc>
         <w:tc>
           <w:tcPr>
-            <w:tcW w:w="2300" w:type="dxa"/>
+            <w:tcW w:w="2218" w:type="dxa"/>
             <w:tcMar>
               <w:left w:w="105" w:type="dxa"/>
               <w:right w:w="105" w:type="dxa"/>
@@ -1108,7 +1108,7 @@
         </w:tc>
         <w:tc>
           <w:tcPr>
-            <w:tcW w:w="2300" w:type="dxa"/>
+            <w:tcW w:w="2218" w:type="dxa"/>
             <w:tcMar>
               <w:left w:w="105" w:type="dxa"/>
               <w:right w:w="105" w:type="dxa"/>
@@ -1129,7 +1129,7 @@
         </w:tc>
         <w:tc>
           <w:tcPr>
-            <w:tcW w:w="3218" w:type="dxa"/>
+            <w:tcW w:w="3104" w:type="dxa"/>
             <w:tcMar>
               <w:left w:w="105" w:type="dxa"/>
               <w:right w:w="105" w:type="dxa"/>
@@ -1277,7 +1277,7 @@
         </w:trPr>
         <w:tc>
           <w:tcPr>
-            <w:tcW w:w="1541" w:type="dxa"/>
+            <w:tcW w:w="1486" w:type="dxa"/>
             <w:tcMar>
               <w:left w:w="105" w:type="dxa"/>
               <w:right w:w="105" w:type="dxa"/>
@@ -1301,7 +1301,7 @@
         </w:tc>
         <w:tc>
           <w:tcPr>
-            <w:tcW w:w="2300" w:type="dxa"/>
+            <w:tcW w:w="2218" w:type="dxa"/>
             <w:tcMar>
               <w:left w:w="105" w:type="dxa"/>
               <w:right w:w="105" w:type="dxa"/>
@@ -1325,7 +1325,7 @@
         </w:tc>
         <w:tc>
           <w:tcPr>
-            <w:tcW w:w="2300" w:type="dxa"/>
+            <w:tcW w:w="2218" w:type="dxa"/>
             <w:tcMar>
               <w:left w:w="105" w:type="dxa"/>
               <w:right w:w="105" w:type="dxa"/>
@@ -1346,7 +1346,7 @@
         </w:tc>
         <w:tc>
           <w:tcPr>
-            <w:tcW w:w="3218" w:type="dxa"/>
+            <w:tcW w:w="3104" w:type="dxa"/>
             <w:tcMar>
               <w:left w:w="105" w:type="dxa"/>
               <w:right w:w="105" w:type="dxa"/>
@@ -1396,7 +1396,7 @@
         </w:trPr>
         <w:tc>
           <w:tcPr>
-            <w:tcW w:w="1541" w:type="dxa"/>
+            <w:tcW w:w="1486" w:type="dxa"/>
             <w:tcMar>
               <w:left w:w="105" w:type="dxa"/>
               <w:right w:w="105" w:type="dxa"/>
@@ -1420,7 +1420,7 @@
         </w:tc>
         <w:tc>
           <w:tcPr>
-            <w:tcW w:w="2300" w:type="dxa"/>
+            <w:tcW w:w="2218" w:type="dxa"/>
             <w:tcMar>
               <w:left w:w="105" w:type="dxa"/>
               <w:right w:w="105" w:type="dxa"/>
@@ -1444,7 +1444,7 @@
         </w:tc>
         <w:tc>
           <w:tcPr>
-            <w:tcW w:w="2300" w:type="dxa"/>
+            <w:tcW w:w="2218" w:type="dxa"/>
             <w:tcMar>
               <w:left w:w="105" w:type="dxa"/>
               <w:right w:w="105" w:type="dxa"/>
@@ -1465,7 +1465,7 @@
         </w:tc>
         <w:tc>
           <w:tcPr>
-            <w:tcW w:w="3218" w:type="dxa"/>
+            <w:tcW w:w="3104" w:type="dxa"/>
             <w:tcMar>
               <w:left w:w="105" w:type="dxa"/>
               <w:right w:w="105" w:type="dxa"/>
@@ -1557,7 +1557,7 @@
         </w:trPr>
         <w:tc>
           <w:tcPr>
-            <w:tcW w:w="1541" w:type="dxa"/>
+            <w:tcW w:w="1486" w:type="dxa"/>
             <w:tcMar>
               <w:left w:w="105" w:type="dxa"/>
               <w:right w:w="105" w:type="dxa"/>
@@ -1581,7 +1581,7 @@
         </w:tc>
         <w:tc>
           <w:tcPr>
-            <w:tcW w:w="2300" w:type="dxa"/>
+            <w:tcW w:w="2218" w:type="dxa"/>
             <w:tcMar>
               <w:left w:w="105" w:type="dxa"/>
               <w:right w:w="105" w:type="dxa"/>
@@ -1605,7 +1605,7 @@
         </w:tc>
         <w:tc>
           <w:tcPr>
-            <w:tcW w:w="2300" w:type="dxa"/>
+            <w:tcW w:w="2218" w:type="dxa"/>
             <w:tcMar>
               <w:left w:w="105" w:type="dxa"/>
               <w:right w:w="105" w:type="dxa"/>
@@ -1626,7 +1626,7 @@
         </w:tc>
         <w:tc>
           <w:tcPr>
-            <w:tcW w:w="3218" w:type="dxa"/>
+            <w:tcW w:w="3104" w:type="dxa"/>
             <w:tcMar>
               <w:left w:w="105" w:type="dxa"/>
               <w:right w:w="105" w:type="dxa"/>
@@ -1655,7 +1655,7 @@
         </w:trPr>
         <w:tc>
           <w:tcPr>
-            <w:tcW w:w="1541" w:type="dxa"/>
+            <w:tcW w:w="1486" w:type="dxa"/>
             <w:tcMar>
               <w:left w:w="105" w:type="dxa"/>
               <w:right w:w="105" w:type="dxa"/>
@@ -1679,7 +1679,7 @@
         </w:tc>
         <w:tc>
           <w:tcPr>
-            <w:tcW w:w="2300" w:type="dxa"/>
+            <w:tcW w:w="2218" w:type="dxa"/>
             <w:tcMar>
               <w:left w:w="105" w:type="dxa"/>
               <w:right w:w="105" w:type="dxa"/>
@@ -1703,7 +1703,7 @@
         </w:tc>
         <w:tc>
           <w:tcPr>
-            <w:tcW w:w="2300" w:type="dxa"/>
+            <w:tcW w:w="2218" w:type="dxa"/>
             <w:tcMar>
               <w:left w:w="105" w:type="dxa"/>
               <w:right w:w="105" w:type="dxa"/>
@@ -1724,7 +1724,7 @@
         </w:tc>
         <w:tc>
           <w:tcPr>
-            <w:tcW w:w="3218" w:type="dxa"/>
+            <w:tcW w:w="3104" w:type="dxa"/>
             <w:tcMar>
               <w:left w:w="105" w:type="dxa"/>
               <w:right w:w="105" w:type="dxa"/>
@@ -1879,15 +1879,15 @@
         <w:tblLook w:firstColumn="1" w:firstRow="1" w:lastColumn="0" w:lastRow="0" w:noHBand="0" w:noVBand="1" w:val="04A0"/>
       </w:tblPr>
       <w:tblGrid>
-        <w:gridCol w:w="2340"/>
-        <w:gridCol w:w="2340"/>
-        <w:gridCol w:w="2340"/>
-        <w:gridCol w:w="2340"/>
+        <w:gridCol w:w="2256"/>
+        <w:gridCol w:w="2256"/>
+        <w:gridCol w:w="2256"/>
+        <w:gridCol w:w="2256"/>
       </w:tblGrid>
       <w:tr>
         <w:tc>
           <w:tcPr>
-            <w:tcW w:type="dxa" w:w="2340"/>
+            <w:tcW w:type="dxa" w:w="2256"/>
           </w:tcPr>
           <w:p>
             <w:pPr>
@@ -1904,7 +1904,7 @@
         </w:tc>
         <w:tc>
           <w:tcPr>
-            <w:tcW w:type="dxa" w:w="2340"/>
+            <w:tcW w:type="dxa" w:w="2256"/>
           </w:tcPr>
           <w:p>
             <w:pPr>
@@ -1921,7 +1921,7 @@
         </w:tc>
         <w:tc>
           <w:tcPr>
-            <w:tcW w:type="dxa" w:w="2340"/>
+            <w:tcW w:type="dxa" w:w="2256"/>
           </w:tcPr>
           <w:p>
             <w:pPr>
@@ -1938,7 +1938,7 @@
         </w:tc>
         <w:tc>
           <w:tcPr>
-            <w:tcW w:type="dxa" w:w="2340"/>
+            <w:tcW w:type="dxa" w:w="2256"/>
           </w:tcPr>
           <w:p>
             <w:pPr>
@@ -1957,7 +1957,7 @@
       <w:tr>
         <w:tc>
           <w:tcPr>
-            <w:tcW w:type="dxa" w:w="2340"/>
+            <w:tcW w:type="dxa" w:w="2256"/>
           </w:tcPr>
           <w:p>
             <w:pPr>
@@ -1974,7 +1974,7 @@
         </w:tc>
         <w:tc>
           <w:tcPr>
-            <w:tcW w:type="dxa" w:w="2340"/>
+            <w:tcW w:type="dxa" w:w="2256"/>
           </w:tcPr>
           <w:p>
             <w:pPr>
@@ -1991,7 +1991,7 @@
         </w:tc>
         <w:tc>
           <w:tcPr>
-            <w:tcW w:type="dxa" w:w="2340"/>
+            <w:tcW w:type="dxa" w:w="2256"/>
           </w:tcPr>
           <w:p>
             <w:pPr>
@@ -2008,7 +2008,7 @@
         </w:tc>
         <w:tc>
           <w:tcPr>
-            <w:tcW w:type="dxa" w:w="2340"/>
+            <w:tcW w:type="dxa" w:w="2256"/>
           </w:tcPr>
           <w:p>
             <w:pPr>
@@ -2027,7 +2027,7 @@
       <w:tr>
         <w:tc>
           <w:tcPr>
-            <w:tcW w:type="dxa" w:w="2340"/>
+            <w:tcW w:type="dxa" w:w="2256"/>
           </w:tcPr>
           <w:p>
             <w:pPr>
@@ -2044,7 +2044,7 @@
         </w:tc>
         <w:tc>
           <w:tcPr>
-            <w:tcW w:type="dxa" w:w="2340"/>
+            <w:tcW w:type="dxa" w:w="2256"/>
           </w:tcPr>
           <w:p>
             <w:pPr>
@@ -2061,7 +2061,7 @@
         </w:tc>
         <w:tc>
           <w:tcPr>
-            <w:tcW w:type="dxa" w:w="2340"/>
+            <w:tcW w:type="dxa" w:w="2256"/>
           </w:tcPr>
           <w:p>
             <w:pPr>
@@ -2078,7 +2078,7 @@
         </w:tc>
         <w:tc>
           <w:tcPr>
-            <w:tcW w:type="dxa" w:w="2340"/>
+            <w:tcW w:type="dxa" w:w="2256"/>
           </w:tcPr>
           <w:p>
             <w:pPr>
@@ -2097,7 +2097,7 @@
       <w:tr>
         <w:tc>
           <w:tcPr>
-            <w:tcW w:type="dxa" w:w="2340"/>
+            <w:tcW w:type="dxa" w:w="2256"/>
           </w:tcPr>
           <w:p>
             <w:pPr>
@@ -2114,7 +2114,7 @@
         </w:tc>
         <w:tc>
           <w:tcPr>
-            <w:tcW w:type="dxa" w:w="2340"/>
+            <w:tcW w:type="dxa" w:w="2256"/>
           </w:tcPr>
           <w:p>
             <w:pPr>
@@ -2131,7 +2131,7 @@
         </w:tc>
         <w:tc>
           <w:tcPr>
-            <w:tcW w:type="dxa" w:w="2340"/>
+            <w:tcW w:type="dxa" w:w="2256"/>
           </w:tcPr>
           <w:p>
             <w:pPr>
@@ -2148,7 +2148,7 @@
         </w:tc>
         <w:tc>
           <w:tcPr>
-            <w:tcW w:type="dxa" w:w="2340"/>
+            <w:tcW w:type="dxa" w:w="2256"/>
           </w:tcPr>
           <w:p>
             <w:pPr>
@@ -2816,7 +2816,7 @@
       </w:r>
     </w:p>
     <w:sectPr>
-      <w:pgSz w:w="12240" w:h="15840"/>
+      <w:pgSz w:w="11906" w:h="16838"/>
       <w:pgMar w:top="1440" w:right="1440" w:bottom="1440" w:left="1440" w:header="720" w:footer="720" w:gutter="0"/>
       <w:cols w:space="720"/>
       <w:docGrid w:linePitch="360"/>

</xml_diff>